<commit_message>
Add attendance rankings and class summary
</commit_message>
<xml_diff>
--- a/templates/report-card-template.docx
+++ b/templates/report-card-template.docx
@@ -552,7 +552,8 @@
         <w:gridCol w:w="1276"/>
         <w:gridCol w:w="1418"/>
         <w:gridCol w:w="1559"/>
-        <w:gridCol w:w="1559"/>
+        <w:gridCol w:w="779"/>
+        <w:gridCol w:w="780"/>
       </w:tblGrid>
       <w:tr>
         <w:tblPrEx>
@@ -858,6 +859,7 @@
         </w:tc>
         <w:tc>
           <w:tcPr>
+            <w:gridSpan w:val="2"/>
             <w:tcBorders>
               <w:top w:val="single" w:color="000000" w:sz="4" w:space="0"/>
               <w:left w:val="single" w:color="000000" w:sz="4" w:space="0"/>
@@ -1060,6 +1062,7 @@
         </w:tc>
         <w:tc>
           <w:tcPr>
+            <w:gridSpan w:val="2"/>
             <w:tcBorders>
               <w:top w:val="single" w:color="000000" w:sz="4" w:space="0"/>
               <w:left w:val="single" w:color="000000" w:sz="4" w:space="0"/>
@@ -1158,6 +1161,7 @@
         </w:tc>
         <w:tc>
           <w:tcPr>
+            <w:vMerge w:val="restart"/>
             <w:gridSpan w:val="2"/>
             <w:tcBorders>
               <w:top w:val="single" w:color="000000" w:sz="4" w:space="0"/>
@@ -1192,6 +1196,7 @@
         </w:tc>
         <w:tc>
           <w:tcPr>
+            <w:vMerge w:val="restart"/>
             <w:gridSpan w:val="2"/>
             <w:tcBorders>
               <w:top w:val="single" w:color="000000" w:sz="4" w:space="0"/>
@@ -1226,6 +1231,7 @@
         </w:tc>
         <w:tc>
           <w:tcPr>
+            <w:vMerge w:val="restart"/>
             <w:tcBorders>
               <w:top w:val="single" w:color="000000" w:sz="4" w:space="0"/>
               <w:left w:val="single" w:color="000000" w:sz="4" w:space="0"/>
@@ -1279,6 +1285,7 @@
         </w:tc>
         <w:tc>
           <w:tcPr>
+            <w:gridSpan w:val="2"/>
             <w:tcBorders>
               <w:top w:val="single" w:color="000000" w:sz="4" w:space="0"/>
               <w:left w:val="single" w:color="000000" w:sz="4" w:space="0"/>
@@ -1307,6 +1314,271 @@
                 <w:rtl w:val="0"/>
               </w:rPr>
               <w:t>Xếp Hạng</w:t>
+            </w:r>
+          </w:p>
+        </w:tc>
+      </w:tr>
+      <w:tr>
+        <w:tblPrEx>
+          <w:tblBorders>
+            <w:top w:val="single" w:color="000000" w:sz="4" w:space="0"/>
+            <w:left w:val="single" w:color="000000" w:sz="4" w:space="0"/>
+            <w:bottom w:val="single" w:color="000000" w:sz="4" w:space="0"/>
+            <w:right w:val="single" w:color="000000" w:sz="4" w:space="0"/>
+            <w:insideH w:val="single" w:color="000000" w:sz="4" w:space="0"/>
+            <w:insideV w:val="single" w:color="000000" w:sz="4" w:space="0"/>
+          </w:tblBorders>
+          <w:tblCellMar>
+            <w:top w:w="0" w:type="dxa"/>
+            <w:left w:w="108" w:type="dxa"/>
+            <w:bottom w:w="0" w:type="dxa"/>
+            <w:right w:w="108" w:type="dxa"/>
+          </w:tblCellMar>
+        </w:tblPrEx>
+        <w:trPr>
+          <w:trHeight w:val="704" w:hRule="atLeast"/>
+        </w:trPr>
+        <w:tc>
+          <w:tcPr>
+            <w:vMerge/>
+            <w:tcBorders>
+              <w:top w:val="single" w:color="000000" w:sz="4" w:space="0"/>
+              <w:left w:val="single" w:color="000000" w:sz="4" w:space="0"/>
+              <w:bottom w:val="single" w:color="000000" w:sz="4" w:space="0"/>
+              <w:right w:val="single" w:color="000000" w:sz="4" w:space="0"/>
+            </w:tcBorders>
+            <w:vAlign w:val="center"/>
+          </w:tcPr>
+          <w:p>
+            <w:pPr>
+              <w:spacing w:after="0" w:line="360" w:lineRule="auto"/>
+              <w:jc w:val="center"/>
+              <w:rPr>
+                <w:rFonts w:hint="default" w:ascii="Times New Roman" w:hAnsi="Times New Roman" w:eastAsia="Times New Roman" w:cs="Times New Roman"/>
+                <w:b/>
+                <w:sz w:val="24"/>
+                <w:szCs w:val="24"/>
+              </w:rPr>
+            </w:pPr>
+            <w:r>
+              <w:rPr>
+                <w:rFonts w:hint="default" w:ascii="Times New Roman" w:hAnsi="Times New Roman" w:eastAsia="Times New Roman" w:cs="Times New Roman"/>
+                <w:b/>
+                <w:sz w:val="18"/>
+                <w:szCs w:val="24"/>
+                <w:rtl w:val="0"/>
+              </w:rPr>
+              <w:t/>
+            </w:r>
+            <w:r>
+              <w:rPr>
+                <w:rFonts w:hint="default" w:ascii="Times New Roman" w:hAnsi="Times New Roman" w:eastAsia="Times New Roman" w:cs="Times New Roman"/>
+                <w:b/>
+                <w:sz w:val="18"/>
+                <w:szCs w:val="24"/>
+                <w:rtl w:val="0"/>
+              </w:rPr>
+              <w:br w:type="textWrapping"/>
+            </w:r>
+            <w:r>
+              <w:rPr>
+                <w:rFonts w:hint="default" w:ascii="Times New Roman" w:hAnsi="Times New Roman" w:eastAsia="Times New Roman" w:cs="Times New Roman"/>
+                <w:b/>
+                <w:sz w:val="18"/>
+                <w:szCs w:val="24"/>
+                <w:rtl w:val="0"/>
+              </w:rPr>
+              <w:t/>
+            </w:r>
+          </w:p>
+        </w:tc>
+        <w:tc>
+          <w:tcPr>
+            <w:vMerge/>
+            <w:gridSpan w:val="2"/>
+            <w:tcBorders>
+              <w:top w:val="single" w:color="000000" w:sz="4" w:space="0"/>
+              <w:left w:val="single" w:color="000000" w:sz="4" w:space="0"/>
+              <w:bottom w:val="single" w:color="000000" w:sz="4" w:space="0"/>
+              <w:right w:val="single" w:color="000000" w:sz="4" w:space="0"/>
+            </w:tcBorders>
+            <w:vAlign w:val="center"/>
+          </w:tcPr>
+          <w:p>
+            <w:pPr>
+              <w:spacing w:after="0" w:line="360" w:lineRule="auto"/>
+              <w:jc w:val="center"/>
+              <w:rPr>
+                <w:rFonts w:hint="default" w:ascii="Times New Roman" w:hAnsi="Times New Roman" w:eastAsia="Times New Roman" w:cs="Times New Roman"/>
+                <w:b/>
+                <w:sz w:val="24"/>
+                <w:szCs w:val="24"/>
+              </w:rPr>
+            </w:pPr>
+            <w:r>
+              <w:rPr>
+                <w:rFonts w:hint="default" w:ascii="Times New Roman" w:hAnsi="Times New Roman" w:eastAsia="Times New Roman" w:cs="Times New Roman"/>
+                <w:b/>
+                <w:sz w:val="24"/>
+                <w:szCs w:val="24"/>
+                <w:rtl w:val="0"/>
+              </w:rPr>
+              <w:t/>
+            </w:r>
+          </w:p>
+        </w:tc>
+        <w:tc>
+          <w:tcPr>
+            <w:vMerge/>
+            <w:gridSpan w:val="2"/>
+            <w:tcBorders>
+              <w:top w:val="single" w:color="000000" w:sz="4" w:space="0"/>
+              <w:left w:val="single" w:color="000000" w:sz="4" w:space="0"/>
+              <w:bottom w:val="single" w:color="000000" w:sz="4" w:space="0"/>
+              <w:right w:val="single" w:color="000000" w:sz="4" w:space="0"/>
+            </w:tcBorders>
+            <w:vAlign w:val="center"/>
+          </w:tcPr>
+          <w:p>
+            <w:pPr>
+              <w:spacing w:after="0" w:line="360" w:lineRule="auto"/>
+              <w:jc w:val="center"/>
+              <w:rPr>
+                <w:rFonts w:hint="default" w:ascii="Times New Roman" w:hAnsi="Times New Roman" w:eastAsia="Times New Roman" w:cs="Times New Roman"/>
+                <w:b/>
+                <w:sz w:val="24"/>
+                <w:szCs w:val="24"/>
+              </w:rPr>
+            </w:pPr>
+            <w:r>
+              <w:rPr>
+                <w:rFonts w:hint="default" w:ascii="Times New Roman" w:hAnsi="Times New Roman" w:eastAsia="Times New Roman" w:cs="Times New Roman"/>
+                <w:b/>
+                <w:sz w:val="24"/>
+                <w:szCs w:val="24"/>
+                <w:rtl w:val="0"/>
+              </w:rPr>
+              <w:t/>
+            </w:r>
+          </w:p>
+        </w:tc>
+        <w:tc>
+          <w:tcPr>
+            <w:vMerge/>
+            <w:tcBorders>
+              <w:top w:val="single" w:color="000000" w:sz="4" w:space="0"/>
+              <w:left w:val="single" w:color="000000" w:sz="4" w:space="0"/>
+              <w:bottom w:val="single" w:color="000000" w:sz="4" w:space="0"/>
+              <w:right w:val="single" w:color="000000" w:sz="4" w:space="0"/>
+            </w:tcBorders>
+            <w:vAlign w:val="center"/>
+          </w:tcPr>
+          <w:p>
+            <w:pPr>
+              <w:spacing w:after="0" w:line="360" w:lineRule="auto"/>
+              <w:jc w:val="center"/>
+              <w:rPr>
+                <w:rFonts w:hint="default" w:ascii="Times New Roman" w:hAnsi="Times New Roman" w:eastAsia="Times New Roman" w:cs="Times New Roman"/>
+                <w:b/>
+                <w:sz w:val="24"/>
+                <w:szCs w:val="24"/>
+              </w:rPr>
+            </w:pPr>
+            <w:r>
+              <w:rPr>
+                <w:rFonts w:hint="default" w:ascii="Times New Roman" w:hAnsi="Times New Roman" w:eastAsia="Times New Roman" w:cs="Times New Roman"/>
+                <w:b/>
+                <w:sz w:val="24"/>
+                <w:szCs w:val="24"/>
+                <w:rtl w:val="0"/>
+              </w:rPr>
+              <w:t xml:space="preserve"/>
+            </w:r>
+            <w:r>
+              <w:rPr>
+                <w:rFonts w:hint="default" w:ascii="Times New Roman" w:hAnsi="Times New Roman" w:eastAsia="Times New Roman" w:cs="Times New Roman"/>
+                <w:b/>
+                <w:sz w:val="24"/>
+                <w:szCs w:val="24"/>
+                <w:rtl w:val="0"/>
+              </w:rPr>
+              <w:br w:type="textWrapping"/>
+            </w:r>
+            <w:r>
+              <w:rPr>
+                <w:rFonts w:hint="default" w:ascii="Times New Roman" w:hAnsi="Times New Roman" w:eastAsia="Times New Roman" w:cs="Times New Roman"/>
+                <w:b/>
+                <w:sz w:val="24"/>
+                <w:szCs w:val="24"/>
+                <w:rtl w:val="0"/>
+              </w:rPr>
+              <w:t/>
+            </w:r>
+          </w:p>
+        </w:tc>
+        <w:tc>
+          <w:tcPr>
+            <w:tcBorders>
+              <w:top w:val="single" w:color="000000" w:sz="4" w:space="0"/>
+              <w:left w:val="single" w:color="000000" w:sz="4" w:space="0"/>
+              <w:bottom w:val="single" w:color="000000" w:sz="4" w:space="0"/>
+              <w:right w:val="single" w:color="000000" w:sz="4" w:space="0"/>
+            </w:tcBorders>
+            <w:vAlign w:val="center"/>
+          </w:tcPr>
+          <w:p>
+            <w:pPr>
+              <w:spacing w:after="0" w:line="360" w:lineRule="auto"/>
+              <w:jc w:val="center"/>
+              <w:rPr>
+                <w:rFonts w:hint="default" w:ascii="Times New Roman" w:hAnsi="Times New Roman" w:eastAsia="Times New Roman" w:cs="Times New Roman"/>
+                <w:b/>
+                <w:sz w:val="24"/>
+                <w:szCs w:val="24"/>
+              </w:rPr>
+            </w:pPr>
+            <w:r>
+              <w:rPr>
+                <w:rFonts w:hint="default" w:ascii="Times New Roman" w:hAnsi="Times New Roman" w:eastAsia="Times New Roman" w:cs="Times New Roman"/>
+                <w:b/>
+                <w:sz w:val="24"/>
+                <w:szCs w:val="24"/>
+                <w:rtl w:val="0"/>
+              </w:rPr>
+              <w:t>CC</w:t>
+            </w:r>
+          </w:p>
+        </w:tc>
+        <w:tc>
+          <w:tcPr>
+            <w:tcBorders>
+              <w:top w:val="single" w:color="000000" w:sz="4" w:space="0"/>
+              <w:left w:val="single" w:color="000000" w:sz="4" w:space="0"/>
+              <w:bottom w:val="single" w:color="000000" w:sz="4" w:space="0"/>
+              <w:right w:val="single" w:color="000000" w:sz="4" w:space="0"/>
+            </w:tcBorders>
+            <w:vAlign w:val="center"/>
+          </w:tcPr>
+          <w:p>
+            <w:pPr>
+              <w:spacing w:after="0" w:line="360" w:lineRule="auto"/>
+              <w:jc w:val="center"/>
+              <w:rPr>
+                <w:rFonts w:hint="default" w:ascii="Times New Roman" w:hAnsi="Times New Roman" w:eastAsia="Times New Roman" w:cs="Times New Roman"/>
+                <w:b/>
+                <w:sz w:val="24"/>
+                <w:szCs w:val="24"/>
+              </w:rPr>
+            </w:pPr>
+            <w:r>
+              <w:rPr>
+                <w:rFonts w:hint="default" w:ascii="Times New Roman" w:hAnsi="Times New Roman" w:eastAsia="Times New Roman" w:cs="Times New Roman"/>
+                <w:b/>
+                <w:sz w:val="24"/>
+                <w:szCs w:val="24"/>
+                <w:rtl w:val="0"/>
+              </w:rPr>
+              <w:t>GL</w:t>
             </w:r>
           </w:p>
         </w:tc>
@@ -1458,7 +1730,30 @@
                 <w:rFonts w:ascii="Times New Roman" w:hAnsi="Times New Roman"/>
                 <w:sz w:val="18"/>
               </w:rPr>
-              <w:t>{HK1_XEP_HANG}</w:t>
+              <w:t>{HK1_XEP_HANG_CC}</w:t>
+            </w:r>
+          </w:p>
+        </w:tc>
+        <w:tc>
+          <w:tcPr>
+            <w:tcBorders>
+              <w:top w:val="single" w:color="000000" w:sz="4" w:space="0"/>
+              <w:left w:val="single" w:color="000000" w:sz="4" w:space="0"/>
+              <w:bottom w:val="single" w:color="000000" w:sz="4" w:space="0"/>
+              <w:right w:val="single" w:color="000000" w:sz="4" w:space="0"/>
+            </w:tcBorders>
+            <w:vAlign w:val="center"/>
+          </w:tcPr>
+          <w:p>
+            <w:pPr>
+              <w:jc w:val="center"/>
+            </w:pPr>
+            <w:r>
+              <w:rPr>
+                <w:rFonts w:ascii="Times New Roman" w:hAnsi="Times New Roman"/>
+                <w:sz w:val="18"/>
+              </w:rPr>
+              <w:t>{HK1_XEP_HANG_GL}</w:t>
             </w:r>
           </w:p>
         </w:tc>
@@ -1505,7 +1800,8 @@
         <w:gridCol w:w="1276"/>
         <w:gridCol w:w="1418"/>
         <w:gridCol w:w="1559"/>
-        <w:gridCol w:w="1559"/>
+        <w:gridCol w:w="779"/>
+        <w:gridCol w:w="780"/>
       </w:tblGrid>
       <w:tr>
         <w:tblPrEx>
@@ -1811,6 +2107,7 @@
         </w:tc>
         <w:tc>
           <w:tcPr>
+            <w:gridSpan w:val="2"/>
             <w:tcBorders>
               <w:top w:val="single" w:color="000000" w:sz="4" w:space="0"/>
               <w:left w:val="single" w:color="000000" w:sz="4" w:space="0"/>
@@ -2013,6 +2310,7 @@
         </w:tc>
         <w:tc>
           <w:tcPr>
+            <w:gridSpan w:val="2"/>
             <w:tcBorders>
               <w:top w:val="single" w:color="000000" w:sz="4" w:space="0"/>
               <w:left w:val="single" w:color="000000" w:sz="4" w:space="0"/>
@@ -2111,6 +2409,7 @@
         </w:tc>
         <w:tc>
           <w:tcPr>
+            <w:vMerge w:val="restart"/>
             <w:gridSpan w:val="2"/>
             <w:tcBorders>
               <w:top w:val="single" w:color="000000" w:sz="4" w:space="0"/>
@@ -2145,6 +2444,7 @@
         </w:tc>
         <w:tc>
           <w:tcPr>
+            <w:vMerge w:val="restart"/>
             <w:gridSpan w:val="2"/>
             <w:tcBorders>
               <w:top w:val="single" w:color="000000" w:sz="4" w:space="0"/>
@@ -2179,6 +2479,7 @@
         </w:tc>
         <w:tc>
           <w:tcPr>
+            <w:vMerge w:val="restart"/>
             <w:tcBorders>
               <w:top w:val="single" w:color="000000" w:sz="4" w:space="0"/>
               <w:left w:val="single" w:color="000000" w:sz="4" w:space="0"/>
@@ -2232,6 +2533,7 @@
         </w:tc>
         <w:tc>
           <w:tcPr>
+            <w:gridSpan w:val="2"/>
             <w:tcBorders>
               <w:top w:val="single" w:color="000000" w:sz="4" w:space="0"/>
               <w:left w:val="single" w:color="000000" w:sz="4" w:space="0"/>
@@ -2260,6 +2562,271 @@
                 <w:rtl w:val="0"/>
               </w:rPr>
               <w:t>Xếp Hạng</w:t>
+            </w:r>
+          </w:p>
+        </w:tc>
+      </w:tr>
+      <w:tr>
+        <w:tblPrEx>
+          <w:tblBorders>
+            <w:top w:val="single" w:color="000000" w:sz="4" w:space="0"/>
+            <w:left w:val="single" w:color="000000" w:sz="4" w:space="0"/>
+            <w:bottom w:val="single" w:color="000000" w:sz="4" w:space="0"/>
+            <w:right w:val="single" w:color="000000" w:sz="4" w:space="0"/>
+            <w:insideH w:val="single" w:color="000000" w:sz="4" w:space="0"/>
+            <w:insideV w:val="single" w:color="000000" w:sz="4" w:space="0"/>
+          </w:tblBorders>
+          <w:tblCellMar>
+            <w:top w:w="0" w:type="dxa"/>
+            <w:left w:w="108" w:type="dxa"/>
+            <w:bottom w:w="0" w:type="dxa"/>
+            <w:right w:w="108" w:type="dxa"/>
+          </w:tblCellMar>
+        </w:tblPrEx>
+        <w:trPr>
+          <w:trHeight w:val="704" w:hRule="atLeast"/>
+        </w:trPr>
+        <w:tc>
+          <w:tcPr>
+            <w:vMerge/>
+            <w:tcBorders>
+              <w:top w:val="single" w:color="000000" w:sz="4" w:space="0"/>
+              <w:left w:val="single" w:color="000000" w:sz="4" w:space="0"/>
+              <w:bottom w:val="single" w:color="000000" w:sz="4" w:space="0"/>
+              <w:right w:val="single" w:color="000000" w:sz="4" w:space="0"/>
+            </w:tcBorders>
+            <w:vAlign w:val="center"/>
+          </w:tcPr>
+          <w:p>
+            <w:pPr>
+              <w:spacing w:after="0" w:line="360" w:lineRule="auto"/>
+              <w:jc w:val="center"/>
+              <w:rPr>
+                <w:rFonts w:hint="default" w:ascii="Times New Roman" w:hAnsi="Times New Roman" w:eastAsia="Times New Roman" w:cs="Times New Roman"/>
+                <w:b/>
+                <w:sz w:val="24"/>
+                <w:szCs w:val="24"/>
+              </w:rPr>
+            </w:pPr>
+            <w:r>
+              <w:rPr>
+                <w:rFonts w:hint="default" w:ascii="Times New Roman" w:hAnsi="Times New Roman" w:eastAsia="Times New Roman" w:cs="Times New Roman"/>
+                <w:b/>
+                <w:sz w:val="18"/>
+                <w:szCs w:val="24"/>
+                <w:rtl w:val="0"/>
+              </w:rPr>
+              <w:t/>
+            </w:r>
+            <w:r>
+              <w:rPr>
+                <w:rFonts w:hint="default" w:ascii="Times New Roman" w:hAnsi="Times New Roman" w:eastAsia="Times New Roman" w:cs="Times New Roman"/>
+                <w:b/>
+                <w:sz w:val="18"/>
+                <w:szCs w:val="24"/>
+                <w:rtl w:val="0"/>
+              </w:rPr>
+              <w:br w:type="textWrapping"/>
+            </w:r>
+            <w:r>
+              <w:rPr>
+                <w:rFonts w:hint="default" w:ascii="Times New Roman" w:hAnsi="Times New Roman" w:eastAsia="Times New Roman" w:cs="Times New Roman"/>
+                <w:b/>
+                <w:sz w:val="18"/>
+                <w:szCs w:val="24"/>
+                <w:rtl w:val="0"/>
+              </w:rPr>
+              <w:t/>
+            </w:r>
+          </w:p>
+        </w:tc>
+        <w:tc>
+          <w:tcPr>
+            <w:vMerge/>
+            <w:gridSpan w:val="2"/>
+            <w:tcBorders>
+              <w:top w:val="single" w:color="000000" w:sz="4" w:space="0"/>
+              <w:left w:val="single" w:color="000000" w:sz="4" w:space="0"/>
+              <w:bottom w:val="single" w:color="000000" w:sz="4" w:space="0"/>
+              <w:right w:val="single" w:color="000000" w:sz="4" w:space="0"/>
+            </w:tcBorders>
+            <w:vAlign w:val="center"/>
+          </w:tcPr>
+          <w:p>
+            <w:pPr>
+              <w:spacing w:after="0" w:line="360" w:lineRule="auto"/>
+              <w:jc w:val="center"/>
+              <w:rPr>
+                <w:rFonts w:hint="default" w:ascii="Times New Roman" w:hAnsi="Times New Roman" w:eastAsia="Times New Roman" w:cs="Times New Roman"/>
+                <w:b/>
+                <w:sz w:val="24"/>
+                <w:szCs w:val="24"/>
+              </w:rPr>
+            </w:pPr>
+            <w:r>
+              <w:rPr>
+                <w:rFonts w:hint="default" w:ascii="Times New Roman" w:hAnsi="Times New Roman" w:eastAsia="Times New Roman" w:cs="Times New Roman"/>
+                <w:b/>
+                <w:sz w:val="24"/>
+                <w:szCs w:val="24"/>
+                <w:rtl w:val="0"/>
+              </w:rPr>
+              <w:t/>
+            </w:r>
+          </w:p>
+        </w:tc>
+        <w:tc>
+          <w:tcPr>
+            <w:vMerge/>
+            <w:gridSpan w:val="2"/>
+            <w:tcBorders>
+              <w:top w:val="single" w:color="000000" w:sz="4" w:space="0"/>
+              <w:left w:val="single" w:color="000000" w:sz="4" w:space="0"/>
+              <w:bottom w:val="single" w:color="000000" w:sz="4" w:space="0"/>
+              <w:right w:val="single" w:color="000000" w:sz="4" w:space="0"/>
+            </w:tcBorders>
+            <w:vAlign w:val="center"/>
+          </w:tcPr>
+          <w:p>
+            <w:pPr>
+              <w:spacing w:after="0" w:line="360" w:lineRule="auto"/>
+              <w:jc w:val="center"/>
+              <w:rPr>
+                <w:rFonts w:hint="default" w:ascii="Times New Roman" w:hAnsi="Times New Roman" w:eastAsia="Times New Roman" w:cs="Times New Roman"/>
+                <w:b/>
+                <w:sz w:val="24"/>
+                <w:szCs w:val="24"/>
+              </w:rPr>
+            </w:pPr>
+            <w:r>
+              <w:rPr>
+                <w:rFonts w:hint="default" w:ascii="Times New Roman" w:hAnsi="Times New Roman" w:eastAsia="Times New Roman" w:cs="Times New Roman"/>
+                <w:b/>
+                <w:sz w:val="24"/>
+                <w:szCs w:val="24"/>
+                <w:rtl w:val="0"/>
+              </w:rPr>
+              <w:t/>
+            </w:r>
+          </w:p>
+        </w:tc>
+        <w:tc>
+          <w:tcPr>
+            <w:vMerge/>
+            <w:tcBorders>
+              <w:top w:val="single" w:color="000000" w:sz="4" w:space="0"/>
+              <w:left w:val="single" w:color="000000" w:sz="4" w:space="0"/>
+              <w:bottom w:val="single" w:color="000000" w:sz="4" w:space="0"/>
+              <w:right w:val="single" w:color="000000" w:sz="4" w:space="0"/>
+            </w:tcBorders>
+            <w:vAlign w:val="center"/>
+          </w:tcPr>
+          <w:p>
+            <w:pPr>
+              <w:spacing w:after="0" w:line="360" w:lineRule="auto"/>
+              <w:jc w:val="center"/>
+              <w:rPr>
+                <w:rFonts w:hint="default" w:ascii="Times New Roman" w:hAnsi="Times New Roman" w:eastAsia="Times New Roman" w:cs="Times New Roman"/>
+                <w:b/>
+                <w:sz w:val="24"/>
+                <w:szCs w:val="24"/>
+              </w:rPr>
+            </w:pPr>
+            <w:r>
+              <w:rPr>
+                <w:rFonts w:hint="default" w:ascii="Times New Roman" w:hAnsi="Times New Roman" w:eastAsia="Times New Roman" w:cs="Times New Roman"/>
+                <w:b/>
+                <w:sz w:val="24"/>
+                <w:szCs w:val="24"/>
+                <w:rtl w:val="0"/>
+              </w:rPr>
+              <w:t xml:space="preserve"/>
+            </w:r>
+            <w:r>
+              <w:rPr>
+                <w:rFonts w:hint="default" w:ascii="Times New Roman" w:hAnsi="Times New Roman" w:eastAsia="Times New Roman" w:cs="Times New Roman"/>
+                <w:b/>
+                <w:sz w:val="24"/>
+                <w:szCs w:val="24"/>
+                <w:rtl w:val="0"/>
+              </w:rPr>
+              <w:br w:type="textWrapping"/>
+            </w:r>
+            <w:r>
+              <w:rPr>
+                <w:rFonts w:hint="default" w:ascii="Times New Roman" w:hAnsi="Times New Roman" w:eastAsia="Times New Roman" w:cs="Times New Roman"/>
+                <w:b/>
+                <w:sz w:val="24"/>
+                <w:szCs w:val="24"/>
+                <w:rtl w:val="0"/>
+              </w:rPr>
+              <w:t/>
+            </w:r>
+          </w:p>
+        </w:tc>
+        <w:tc>
+          <w:tcPr>
+            <w:tcBorders>
+              <w:top w:val="single" w:color="000000" w:sz="4" w:space="0"/>
+              <w:left w:val="single" w:color="000000" w:sz="4" w:space="0"/>
+              <w:bottom w:val="single" w:color="000000" w:sz="4" w:space="0"/>
+              <w:right w:val="single" w:color="000000" w:sz="4" w:space="0"/>
+            </w:tcBorders>
+            <w:vAlign w:val="center"/>
+          </w:tcPr>
+          <w:p>
+            <w:pPr>
+              <w:spacing w:after="0" w:line="360" w:lineRule="auto"/>
+              <w:jc w:val="center"/>
+              <w:rPr>
+                <w:rFonts w:hint="default" w:ascii="Times New Roman" w:hAnsi="Times New Roman" w:eastAsia="Times New Roman" w:cs="Times New Roman"/>
+                <w:b/>
+                <w:sz w:val="24"/>
+                <w:szCs w:val="24"/>
+              </w:rPr>
+            </w:pPr>
+            <w:r>
+              <w:rPr>
+                <w:rFonts w:hint="default" w:ascii="Times New Roman" w:hAnsi="Times New Roman" w:eastAsia="Times New Roman" w:cs="Times New Roman"/>
+                <w:b/>
+                <w:sz w:val="24"/>
+                <w:szCs w:val="24"/>
+                <w:rtl w:val="0"/>
+              </w:rPr>
+              <w:t>CC</w:t>
+            </w:r>
+          </w:p>
+        </w:tc>
+        <w:tc>
+          <w:tcPr>
+            <w:tcBorders>
+              <w:top w:val="single" w:color="000000" w:sz="4" w:space="0"/>
+              <w:left w:val="single" w:color="000000" w:sz="4" w:space="0"/>
+              <w:bottom w:val="single" w:color="000000" w:sz="4" w:space="0"/>
+              <w:right w:val="single" w:color="000000" w:sz="4" w:space="0"/>
+            </w:tcBorders>
+            <w:vAlign w:val="center"/>
+          </w:tcPr>
+          <w:p>
+            <w:pPr>
+              <w:spacing w:after="0" w:line="360" w:lineRule="auto"/>
+              <w:jc w:val="center"/>
+              <w:rPr>
+                <w:rFonts w:hint="default" w:ascii="Times New Roman" w:hAnsi="Times New Roman" w:eastAsia="Times New Roman" w:cs="Times New Roman"/>
+                <w:b/>
+                <w:sz w:val="24"/>
+                <w:szCs w:val="24"/>
+              </w:rPr>
+            </w:pPr>
+            <w:r>
+              <w:rPr>
+                <w:rFonts w:hint="default" w:ascii="Times New Roman" w:hAnsi="Times New Roman" w:eastAsia="Times New Roman" w:cs="Times New Roman"/>
+                <w:b/>
+                <w:sz w:val="24"/>
+                <w:szCs w:val="24"/>
+                <w:rtl w:val="0"/>
+              </w:rPr>
+              <w:t>GL</w:t>
             </w:r>
           </w:p>
         </w:tc>
@@ -2411,7 +2978,30 @@
                 <w:rFonts w:ascii="Times New Roman" w:hAnsi="Times New Roman"/>
                 <w:sz w:val="18"/>
               </w:rPr>
-              <w:t>{HK2_XEP_HANG}</w:t>
+              <w:t>{HK2_XEP_HANG_CC}</w:t>
+            </w:r>
+          </w:p>
+        </w:tc>
+        <w:tc>
+          <w:tcPr>
+            <w:tcBorders>
+              <w:top w:val="single" w:color="000000" w:sz="4" w:space="0"/>
+              <w:left w:val="single" w:color="000000" w:sz="4" w:space="0"/>
+              <w:bottom w:val="single" w:color="000000" w:sz="4" w:space="0"/>
+              <w:right w:val="single" w:color="000000" w:sz="4" w:space="0"/>
+            </w:tcBorders>
+            <w:vAlign w:val="center"/>
+          </w:tcPr>
+          <w:p>
+            <w:pPr>
+              <w:jc w:val="center"/>
+            </w:pPr>
+            <w:r>
+              <w:rPr>
+                <w:rFonts w:ascii="Times New Roman" w:hAnsi="Times New Roman"/>
+                <w:sz w:val="18"/>
+              </w:rPr>
+              <w:t>{HK2_XEP_HANG_GL}</w:t>
             </w:r>
           </w:p>
         </w:tc>
@@ -2458,7 +3048,8 @@
         <w:gridCol w:w="1276"/>
         <w:gridCol w:w="1418"/>
         <w:gridCol w:w="1559"/>
-        <w:gridCol w:w="1559"/>
+        <w:gridCol w:w="779"/>
+        <w:gridCol w:w="780"/>
       </w:tblGrid>
       <w:tr>
         <w:tblPrEx>
@@ -2764,6 +3355,7 @@
         </w:tc>
         <w:tc>
           <w:tcPr>
+            <w:gridSpan w:val="2"/>
             <w:tcBorders>
               <w:top w:val="single" w:color="000000" w:sz="4" w:space="0"/>
               <w:left w:val="single" w:color="000000" w:sz="4" w:space="0"/>
@@ -2966,6 +3558,7 @@
         </w:tc>
         <w:tc>
           <w:tcPr>
+            <w:gridSpan w:val="2"/>
             <w:tcBorders>
               <w:top w:val="single" w:color="000000" w:sz="4" w:space="0"/>
               <w:left w:val="single" w:color="000000" w:sz="4" w:space="0"/>
@@ -3064,6 +3657,7 @@
         </w:tc>
         <w:tc>
           <w:tcPr>
+            <w:vMerge w:val="restart"/>
             <w:gridSpan w:val="2"/>
             <w:tcBorders>
               <w:top w:val="single" w:color="000000" w:sz="4" w:space="0"/>
@@ -3098,6 +3692,7 @@
         </w:tc>
         <w:tc>
           <w:tcPr>
+            <w:vMerge w:val="restart"/>
             <w:gridSpan w:val="2"/>
             <w:tcBorders>
               <w:top w:val="single" w:color="000000" w:sz="4" w:space="0"/>
@@ -3132,6 +3727,7 @@
         </w:tc>
         <w:tc>
           <w:tcPr>
+            <w:vMerge w:val="restart"/>
             <w:tcBorders>
               <w:top w:val="single" w:color="000000" w:sz="4" w:space="0"/>
               <w:left w:val="single" w:color="000000" w:sz="4" w:space="0"/>
@@ -3185,6 +3781,7 @@
         </w:tc>
         <w:tc>
           <w:tcPr>
+            <w:gridSpan w:val="2"/>
             <w:tcBorders>
               <w:top w:val="single" w:color="000000" w:sz="4" w:space="0"/>
               <w:left w:val="single" w:color="000000" w:sz="4" w:space="0"/>
@@ -3213,6 +3810,271 @@
                 <w:rtl w:val="0"/>
               </w:rPr>
               <w:t>Xếp Hạng</w:t>
+            </w:r>
+          </w:p>
+        </w:tc>
+      </w:tr>
+      <w:tr>
+        <w:tblPrEx>
+          <w:tblBorders>
+            <w:top w:val="single" w:color="000000" w:sz="4" w:space="0"/>
+            <w:left w:val="single" w:color="000000" w:sz="4" w:space="0"/>
+            <w:bottom w:val="single" w:color="000000" w:sz="4" w:space="0"/>
+            <w:right w:val="single" w:color="000000" w:sz="4" w:space="0"/>
+            <w:insideH w:val="single" w:color="000000" w:sz="4" w:space="0"/>
+            <w:insideV w:val="single" w:color="000000" w:sz="4" w:space="0"/>
+          </w:tblBorders>
+          <w:tblCellMar>
+            <w:top w:w="0" w:type="dxa"/>
+            <w:left w:w="108" w:type="dxa"/>
+            <w:bottom w:w="0" w:type="dxa"/>
+            <w:right w:w="108" w:type="dxa"/>
+          </w:tblCellMar>
+        </w:tblPrEx>
+        <w:trPr>
+          <w:trHeight w:val="704" w:hRule="atLeast"/>
+        </w:trPr>
+        <w:tc>
+          <w:tcPr>
+            <w:vMerge/>
+            <w:tcBorders>
+              <w:top w:val="single" w:color="000000" w:sz="4" w:space="0"/>
+              <w:left w:val="single" w:color="000000" w:sz="4" w:space="0"/>
+              <w:bottom w:val="single" w:color="000000" w:sz="4" w:space="0"/>
+              <w:right w:val="single" w:color="000000" w:sz="4" w:space="0"/>
+            </w:tcBorders>
+            <w:vAlign w:val="center"/>
+          </w:tcPr>
+          <w:p>
+            <w:pPr>
+              <w:spacing w:after="0" w:line="360" w:lineRule="auto"/>
+              <w:jc w:val="center"/>
+              <w:rPr>
+                <w:rFonts w:hint="default" w:ascii="Times New Roman" w:hAnsi="Times New Roman" w:eastAsia="Times New Roman" w:cs="Times New Roman"/>
+                <w:b/>
+                <w:sz w:val="24"/>
+                <w:szCs w:val="24"/>
+              </w:rPr>
+            </w:pPr>
+            <w:r>
+              <w:rPr>
+                <w:rFonts w:hint="default" w:ascii="Times New Roman" w:hAnsi="Times New Roman" w:eastAsia="Times New Roman" w:cs="Times New Roman"/>
+                <w:b/>
+                <w:sz w:val="18"/>
+                <w:szCs w:val="24"/>
+                <w:rtl w:val="0"/>
+              </w:rPr>
+              <w:t/>
+            </w:r>
+            <w:r>
+              <w:rPr>
+                <w:rFonts w:hint="default" w:ascii="Times New Roman" w:hAnsi="Times New Roman" w:eastAsia="Times New Roman" w:cs="Times New Roman"/>
+                <w:b/>
+                <w:sz w:val="18"/>
+                <w:szCs w:val="24"/>
+                <w:rtl w:val="0"/>
+              </w:rPr>
+              <w:br w:type="textWrapping"/>
+            </w:r>
+            <w:r>
+              <w:rPr>
+                <w:rFonts w:hint="default" w:ascii="Times New Roman" w:hAnsi="Times New Roman" w:eastAsia="Times New Roman" w:cs="Times New Roman"/>
+                <w:b/>
+                <w:sz w:val="18"/>
+                <w:szCs w:val="24"/>
+                <w:rtl w:val="0"/>
+              </w:rPr>
+              <w:t/>
+            </w:r>
+          </w:p>
+        </w:tc>
+        <w:tc>
+          <w:tcPr>
+            <w:vMerge/>
+            <w:gridSpan w:val="2"/>
+            <w:tcBorders>
+              <w:top w:val="single" w:color="000000" w:sz="4" w:space="0"/>
+              <w:left w:val="single" w:color="000000" w:sz="4" w:space="0"/>
+              <w:bottom w:val="single" w:color="000000" w:sz="4" w:space="0"/>
+              <w:right w:val="single" w:color="000000" w:sz="4" w:space="0"/>
+            </w:tcBorders>
+            <w:vAlign w:val="center"/>
+          </w:tcPr>
+          <w:p>
+            <w:pPr>
+              <w:spacing w:after="0" w:line="360" w:lineRule="auto"/>
+              <w:jc w:val="center"/>
+              <w:rPr>
+                <w:rFonts w:hint="default" w:ascii="Times New Roman" w:hAnsi="Times New Roman" w:eastAsia="Times New Roman" w:cs="Times New Roman"/>
+                <w:b/>
+                <w:sz w:val="24"/>
+                <w:szCs w:val="24"/>
+              </w:rPr>
+            </w:pPr>
+            <w:r>
+              <w:rPr>
+                <w:rFonts w:hint="default" w:ascii="Times New Roman" w:hAnsi="Times New Roman" w:eastAsia="Times New Roman" w:cs="Times New Roman"/>
+                <w:b/>
+                <w:sz w:val="24"/>
+                <w:szCs w:val="24"/>
+                <w:rtl w:val="0"/>
+              </w:rPr>
+              <w:t/>
+            </w:r>
+          </w:p>
+        </w:tc>
+        <w:tc>
+          <w:tcPr>
+            <w:vMerge/>
+            <w:gridSpan w:val="2"/>
+            <w:tcBorders>
+              <w:top w:val="single" w:color="000000" w:sz="4" w:space="0"/>
+              <w:left w:val="single" w:color="000000" w:sz="4" w:space="0"/>
+              <w:bottom w:val="single" w:color="000000" w:sz="4" w:space="0"/>
+              <w:right w:val="single" w:color="000000" w:sz="4" w:space="0"/>
+            </w:tcBorders>
+            <w:vAlign w:val="center"/>
+          </w:tcPr>
+          <w:p>
+            <w:pPr>
+              <w:spacing w:after="0" w:line="360" w:lineRule="auto"/>
+              <w:jc w:val="center"/>
+              <w:rPr>
+                <w:rFonts w:hint="default" w:ascii="Times New Roman" w:hAnsi="Times New Roman" w:eastAsia="Times New Roman" w:cs="Times New Roman"/>
+                <w:b/>
+                <w:sz w:val="24"/>
+                <w:szCs w:val="24"/>
+              </w:rPr>
+            </w:pPr>
+            <w:r>
+              <w:rPr>
+                <w:rFonts w:hint="default" w:ascii="Times New Roman" w:hAnsi="Times New Roman" w:eastAsia="Times New Roman" w:cs="Times New Roman"/>
+                <w:b/>
+                <w:sz w:val="24"/>
+                <w:szCs w:val="24"/>
+                <w:rtl w:val="0"/>
+              </w:rPr>
+              <w:t/>
+            </w:r>
+          </w:p>
+        </w:tc>
+        <w:tc>
+          <w:tcPr>
+            <w:vMerge/>
+            <w:tcBorders>
+              <w:top w:val="single" w:color="000000" w:sz="4" w:space="0"/>
+              <w:left w:val="single" w:color="000000" w:sz="4" w:space="0"/>
+              <w:bottom w:val="single" w:color="000000" w:sz="4" w:space="0"/>
+              <w:right w:val="single" w:color="000000" w:sz="4" w:space="0"/>
+            </w:tcBorders>
+            <w:vAlign w:val="center"/>
+          </w:tcPr>
+          <w:p>
+            <w:pPr>
+              <w:spacing w:after="0" w:line="360" w:lineRule="auto"/>
+              <w:jc w:val="center"/>
+              <w:rPr>
+                <w:rFonts w:hint="default" w:ascii="Times New Roman" w:hAnsi="Times New Roman" w:eastAsia="Times New Roman" w:cs="Times New Roman"/>
+                <w:b/>
+                <w:sz w:val="24"/>
+                <w:szCs w:val="24"/>
+              </w:rPr>
+            </w:pPr>
+            <w:r>
+              <w:rPr>
+                <w:rFonts w:hint="default" w:ascii="Times New Roman" w:hAnsi="Times New Roman" w:eastAsia="Times New Roman" w:cs="Times New Roman"/>
+                <w:b/>
+                <w:sz w:val="24"/>
+                <w:szCs w:val="24"/>
+                <w:rtl w:val="0"/>
+              </w:rPr>
+              <w:t xml:space="preserve"/>
+            </w:r>
+            <w:r>
+              <w:rPr>
+                <w:rFonts w:hint="default" w:ascii="Times New Roman" w:hAnsi="Times New Roman" w:eastAsia="Times New Roman" w:cs="Times New Roman"/>
+                <w:b/>
+                <w:sz w:val="24"/>
+                <w:szCs w:val="24"/>
+                <w:rtl w:val="0"/>
+              </w:rPr>
+              <w:br w:type="textWrapping"/>
+            </w:r>
+            <w:r>
+              <w:rPr>
+                <w:rFonts w:hint="default" w:ascii="Times New Roman" w:hAnsi="Times New Roman" w:eastAsia="Times New Roman" w:cs="Times New Roman"/>
+                <w:b/>
+                <w:sz w:val="24"/>
+                <w:szCs w:val="24"/>
+                <w:rtl w:val="0"/>
+              </w:rPr>
+              <w:t/>
+            </w:r>
+          </w:p>
+        </w:tc>
+        <w:tc>
+          <w:tcPr>
+            <w:tcBorders>
+              <w:top w:val="single" w:color="000000" w:sz="4" w:space="0"/>
+              <w:left w:val="single" w:color="000000" w:sz="4" w:space="0"/>
+              <w:bottom w:val="single" w:color="000000" w:sz="4" w:space="0"/>
+              <w:right w:val="single" w:color="000000" w:sz="4" w:space="0"/>
+            </w:tcBorders>
+            <w:vAlign w:val="center"/>
+          </w:tcPr>
+          <w:p>
+            <w:pPr>
+              <w:spacing w:after="0" w:line="360" w:lineRule="auto"/>
+              <w:jc w:val="center"/>
+              <w:rPr>
+                <w:rFonts w:hint="default" w:ascii="Times New Roman" w:hAnsi="Times New Roman" w:eastAsia="Times New Roman" w:cs="Times New Roman"/>
+                <w:b/>
+                <w:sz w:val="24"/>
+                <w:szCs w:val="24"/>
+              </w:rPr>
+            </w:pPr>
+            <w:r>
+              <w:rPr>
+                <w:rFonts w:hint="default" w:ascii="Times New Roman" w:hAnsi="Times New Roman" w:eastAsia="Times New Roman" w:cs="Times New Roman"/>
+                <w:b/>
+                <w:sz w:val="24"/>
+                <w:szCs w:val="24"/>
+                <w:rtl w:val="0"/>
+              </w:rPr>
+              <w:t>CC</w:t>
+            </w:r>
+          </w:p>
+        </w:tc>
+        <w:tc>
+          <w:tcPr>
+            <w:tcBorders>
+              <w:top w:val="single" w:color="000000" w:sz="4" w:space="0"/>
+              <w:left w:val="single" w:color="000000" w:sz="4" w:space="0"/>
+              <w:bottom w:val="single" w:color="000000" w:sz="4" w:space="0"/>
+              <w:right w:val="single" w:color="000000" w:sz="4" w:space="0"/>
+            </w:tcBorders>
+            <w:vAlign w:val="center"/>
+          </w:tcPr>
+          <w:p>
+            <w:pPr>
+              <w:spacing w:after="0" w:line="360" w:lineRule="auto"/>
+              <w:jc w:val="center"/>
+              <w:rPr>
+                <w:rFonts w:hint="default" w:ascii="Times New Roman" w:hAnsi="Times New Roman" w:eastAsia="Times New Roman" w:cs="Times New Roman"/>
+                <w:b/>
+                <w:sz w:val="24"/>
+                <w:szCs w:val="24"/>
+              </w:rPr>
+            </w:pPr>
+            <w:r>
+              <w:rPr>
+                <w:rFonts w:hint="default" w:ascii="Times New Roman" w:hAnsi="Times New Roman" w:eastAsia="Times New Roman" w:cs="Times New Roman"/>
+                <w:b/>
+                <w:sz w:val="24"/>
+                <w:szCs w:val="24"/>
+                <w:rtl w:val="0"/>
+              </w:rPr>
+              <w:t>GL</w:t>
             </w:r>
           </w:p>
         </w:tc>
@@ -3364,7 +4226,30 @@
                 <w:rFonts w:ascii="Times New Roman" w:hAnsi="Times New Roman"/>
                 <w:sz w:val="18"/>
               </w:rPr>
-              <w:t>{CN_XEP_HANG}</w:t>
+              <w:t>{CN_XEP_HANG_CC}</w:t>
+            </w:r>
+          </w:p>
+        </w:tc>
+        <w:tc>
+          <w:tcPr>
+            <w:tcBorders>
+              <w:top w:val="single" w:color="000000" w:sz="4" w:space="0"/>
+              <w:left w:val="single" w:color="000000" w:sz="4" w:space="0"/>
+              <w:bottom w:val="single" w:color="000000" w:sz="4" w:space="0"/>
+              <w:right w:val="single" w:color="000000" w:sz="4" w:space="0"/>
+            </w:tcBorders>
+            <w:vAlign w:val="center"/>
+          </w:tcPr>
+          <w:p>
+            <w:pPr>
+              <w:jc w:val="center"/>
+            </w:pPr>
+            <w:r>
+              <w:rPr>
+                <w:rFonts w:ascii="Times New Roman" w:hAnsi="Times New Roman"/>
+                <w:sz w:val="18"/>
+              </w:rPr>
+              <w:t>{CN_XEP_HANG_GL}</w:t>
             </w:r>
           </w:p>
         </w:tc>

</xml_diff>